<commit_message>
Corrige la descripcion de la jerarquia del tablero
Al cargar el backlog en Jira se descubrio que Funcion e Historia estan
en el mismo nivel de jerarquia (ambas hierarchyLevel 0), de modo que una
historia no puede colgar de una funcion: Jira rechaza la relacion. La
jerarquia real tiene tres niveles y no cuatro como decia el documento.

Las 51 historias cuelgan entonces de su epica, igual que ya lo hacian las
once historias de arquitectura, y la relacion con su funcion se expresa
con una etiqueta FE-01 a FE-10 que permite filtrar en el tablero.

Por la misma razon se retiro la estimacion de las diez funciones: si
funcion e historia llevaran puntos, el tablero sumaria dos veces el mismo
trabajo y mostraria 298 SP donde el backlog real son 229.
</commit_message>
<xml_diff>
--- a/documentos/semana-4/entregables_semana4.docx
+++ b/documentos/semana-4/entregables_semana4.docx
@@ -1316,7 +1316,40 @@
               <w:spacing w:before="20" w:after="20"/>
             </w:pPr>
             <w:r>
-              <w:t xml:space="preserve">Función a la que pertenece la historia</w:t>
+              <w:t xml:space="preserve">Función a la que pertenece la historia. Función e Historia son tipos del mismo nivel en Jira, así que la relación se expresa con esta etiqueta y no con la jerarquía</w:t>
+            </w:r>
+          </w:p>
+        </w:tc>
+      </w:tr>
+      <w:tr>
+        <w:tc>
+          <w:tcPr>
+            <w:tcW w:w="0" w:type="auto"/>
+          </w:tcPr>
+          <w:p>
+            <w:pPr>
+              <w:spacing w:before="20" w:after="20"/>
+            </w:pPr>
+            <w:r>
+              <w:rPr>
+                <w:rFonts w:ascii="Consolas" w:hAnsi="Consolas"/>
+                <w:sz w:val="18"/>
+                <w:color w:val="B03A2E"/>
+              </w:rPr>
+              <w:t xml:space="preserve">funcion</w:t>
+            </w:r>
+          </w:p>
+        </w:tc>
+        <w:tc>
+          <w:tcPr>
+            <w:tcW w:w="0" w:type="auto"/>
+          </w:tcPr>
+          <w:p>
+            <w:pPr>
+              <w:spacing w:before="20" w:after="20"/>
+            </w:pPr>
+            <w:r>
+              <w:t xml:space="preserve">Marca los diez ítems de tipo Función</w:t>
             </w:r>
           </w:p>
         </w:tc>

</xml_diff>